<commit_message>
corrige informações de contato e formatação no currículo
</commit_message>
<xml_diff>
--- a/doc/Curriculum  Jhonatan[1]-2.docx
+++ b/doc/Curriculum  Jhonatan[1]-2.docx
@@ -123,6 +123,7 @@
           <w:szCs w:val="20"/>
         </w:rPr>
       </w:pPr>
+      <w:proofErr w:type="gramStart"/>
       <w:r>
         <w:rPr>
           <w:rFonts w:ascii="Arial" w:eastAsia="Arial" w:hAnsi="Arial" w:cs="Arial"/>
@@ -133,6 +134,7 @@
         </w:rPr>
         <w:t>CNH :</w:t>
       </w:r>
+      <w:proofErr w:type="gramEnd"/>
       <w:r>
         <w:rPr>
           <w:rFonts w:ascii="Arial" w:eastAsia="Arial" w:hAnsi="Arial" w:cs="Arial"/>
@@ -199,7 +201,7 @@
           <w:sz w:val="20"/>
           <w:szCs w:val="20"/>
         </w:rPr>
-        <w:t>421</w:t>
+        <w:t>262</w:t>
       </w:r>
       <w:r>
         <w:rPr>
@@ -336,16 +338,72 @@
           <w:sz w:val="20"/>
           <w:szCs w:val="20"/>
         </w:rPr>
-        <w:t>Cel.: (17)</w:t>
-      </w:r>
-      <w:r>
-        <w:rPr>
-          <w:rFonts w:ascii="Arial" w:eastAsia="Arial" w:hAnsi="Arial" w:cs="Arial"/>
-          <w:b/>
-          <w:sz w:val="20"/>
-          <w:szCs w:val="20"/>
-        </w:rPr>
-        <w:t xml:space="preserve"> 99205-4294/ (17) 99244-1005</w:t>
+        <w:t>Cel.</w:t>
+      </w:r>
+      <w:proofErr w:type="gramStart"/>
+      <w:r>
+        <w:rPr>
+          <w:rFonts w:ascii="Arial" w:eastAsia="Arial" w:hAnsi="Arial" w:cs="Arial"/>
+          <w:b/>
+          <w:sz w:val="20"/>
+          <w:szCs w:val="20"/>
+        </w:rPr>
+        <w:t>:</w:t>
+      </w:r>
+      <w:r>
+        <w:rPr>
+          <w:rFonts w:ascii="Arial" w:eastAsia="Arial" w:hAnsi="Arial" w:cs="Arial"/>
+          <w:b/>
+          <w:sz w:val="20"/>
+          <w:szCs w:val="20"/>
+        </w:rPr>
+        <w:t xml:space="preserve"> </w:t>
+      </w:r>
+      <w:r>
+        <w:rPr>
+          <w:rFonts w:ascii="Arial" w:eastAsia="Arial" w:hAnsi="Arial" w:cs="Arial"/>
+          <w:b/>
+          <w:sz w:val="20"/>
+          <w:szCs w:val="20"/>
+        </w:rPr>
+        <w:t xml:space="preserve"> (</w:t>
+      </w:r>
+      <w:proofErr w:type="gramEnd"/>
+      <w:r>
+        <w:rPr>
+          <w:rFonts w:ascii="Arial" w:eastAsia="Arial" w:hAnsi="Arial" w:cs="Arial"/>
+          <w:b/>
+          <w:sz w:val="20"/>
+          <w:szCs w:val="20"/>
+        </w:rPr>
+        <w:t>17) 99244-1005</w:t>
+      </w:r>
+      <w:r>
+        <w:rPr>
+          <w:rFonts w:ascii="Arial" w:eastAsia="Arial" w:hAnsi="Arial" w:cs="Arial"/>
+          <w:b/>
+          <w:sz w:val="20"/>
+          <w:szCs w:val="20"/>
+        </w:rPr>
+        <w:t xml:space="preserve"> /</w:t>
+      </w:r>
+      <w:r>
+        <w:rPr>
+          <w:rFonts w:ascii="Arial" w:eastAsia="Arial" w:hAnsi="Arial" w:cs="Arial"/>
+          <w:b/>
+          <w:sz w:val="20"/>
+          <w:szCs w:val="20"/>
+        </w:rPr>
+        <w:t xml:space="preserve"> (17)</w:t>
+      </w:r>
+      <w:r>
+        <w:rPr>
+          <w:rFonts w:ascii="Arial" w:eastAsia="Arial" w:hAnsi="Arial" w:cs="Arial"/>
+          <w:b/>
+          <w:sz w:val="20"/>
+          <w:szCs w:val="20"/>
+        </w:rPr>
+        <w:t xml:space="preserve"> 99205-4294</w:t>
       </w:r>
     </w:p>
     <w:p>
@@ -426,7 +484,25 @@
           <w:sz w:val="20"/>
           <w:szCs w:val="20"/>
         </w:rPr>
-        <w:t>Busco atuar de maneira que eu possa ser produtivo para à empresa, desenvolvendo um trabalho com parceria, comunicação e dinâmica, onde eu possa demonstrar meu conhecimento e vir à aprender junto. Garanto minha responsabilidade</w:t>
+        <w:t xml:space="preserve">Busco atuar de maneira que eu possa ser produtivo para à empresa, desenvolvendo um trabalho com parceria, comunicação e dinâmica, onde eu possa demonstrar meu conhecimento e vir </w:t>
+      </w:r>
+      <w:proofErr w:type="gramStart"/>
+      <w:r>
+        <w:rPr>
+          <w:rFonts w:ascii="Arial" w:hAnsi="Arial" w:cs="Arial"/>
+          <w:sz w:val="20"/>
+          <w:szCs w:val="20"/>
+        </w:rPr>
+        <w:t>à</w:t>
+      </w:r>
+      <w:proofErr w:type="gramEnd"/>
+      <w:r>
+        <w:rPr>
+          <w:rFonts w:ascii="Arial" w:hAnsi="Arial" w:cs="Arial"/>
+          <w:sz w:val="20"/>
+          <w:szCs w:val="20"/>
+        </w:rPr>
+        <w:t xml:space="preserve"> aprender junto. Garanto minha responsabilidade</w:t>
       </w:r>
       <w:r>
         <w:rPr>
@@ -436,16 +512,14 @@
         </w:rPr>
         <w:t xml:space="preserve"> em ambos habilidade como na </w:t>
       </w:r>
-      <w:proofErr w:type="spellStart"/>
-      <w:r>
-        <w:rPr>
-          <w:rFonts w:ascii="Arial" w:hAnsi="Arial" w:cs="Arial"/>
-          <w:sz w:val="20"/>
-          <w:szCs w:val="20"/>
-        </w:rPr>
-        <w:t>area</w:t>
-      </w:r>
-      <w:proofErr w:type="spellEnd"/>
+      <w:r>
+        <w:rPr>
+          <w:rFonts w:ascii="Arial" w:hAnsi="Arial" w:cs="Arial"/>
+          <w:sz w:val="20"/>
+          <w:szCs w:val="20"/>
+        </w:rPr>
+        <w:t>área</w:t>
+      </w:r>
       <w:r>
         <w:rPr>
           <w:rFonts w:ascii="Arial" w:hAnsi="Arial" w:cs="Arial"/>
@@ -454,13 +528,23 @@
         </w:rPr>
         <w:t xml:space="preserve"> de programação e na Telecomunicação </w:t>
       </w:r>
-      <w:r>
-        <w:rPr>
-          <w:rFonts w:ascii="Arial" w:hAnsi="Arial" w:cs="Arial"/>
-          <w:sz w:val="20"/>
-          <w:szCs w:val="20"/>
-        </w:rPr>
-        <w:t>e também estou disposto a cumprir as metas e os prazos que me forem estipulados. Me disponibilizo para cargo disponível ou compatível com os conhecimentos apresentados nesse documento.</w:t>
+      <w:proofErr w:type="gramStart"/>
+      <w:r>
+        <w:rPr>
+          <w:rFonts w:ascii="Arial" w:hAnsi="Arial" w:cs="Arial"/>
+          <w:sz w:val="20"/>
+          <w:szCs w:val="20"/>
+        </w:rPr>
+        <w:t>e também</w:t>
+      </w:r>
+      <w:proofErr w:type="gramEnd"/>
+      <w:r>
+        <w:rPr>
+          <w:rFonts w:ascii="Arial" w:hAnsi="Arial" w:cs="Arial"/>
+          <w:sz w:val="20"/>
+          <w:szCs w:val="20"/>
+        </w:rPr>
+        <w:t xml:space="preserve"> estou disposto a cumprir as metas e os prazos que me forem estipulados. Me disponibilizo para cargo disponível ou compatível com os conhecimentos apresentados nesse documento.</w:t>
       </w:r>
     </w:p>
     <w:p>
@@ -855,41 +939,21 @@
         </w:rPr>
         <w:t xml:space="preserve"> Administração e atendimento ao </w:t>
       </w:r>
-      <w:proofErr w:type="spellStart"/>
-      <w:r>
-        <w:rPr>
-          <w:rFonts w:ascii="Arial" w:eastAsia="Arial" w:hAnsi="Arial" w:cs="Arial"/>
-          <w:sz w:val="20"/>
-          <w:szCs w:val="20"/>
-        </w:rPr>
-        <w:t>publico</w:t>
-      </w:r>
-      <w:proofErr w:type="spellEnd"/>
-      <w:r>
-        <w:rPr>
-          <w:rFonts w:ascii="Arial" w:eastAsia="Arial" w:hAnsi="Arial" w:cs="Arial"/>
-          <w:sz w:val="20"/>
-          <w:szCs w:val="20"/>
-        </w:rPr>
-        <w:t xml:space="preserve">, conhecimento em Informática. em assistência manutenção e Instalação de computadores / Redes Lan e </w:t>
-      </w:r>
-      <w:proofErr w:type="spellStart"/>
-      <w:r>
-        <w:rPr>
-          <w:rFonts w:ascii="Arial" w:eastAsia="Arial" w:hAnsi="Arial" w:cs="Arial"/>
-          <w:sz w:val="20"/>
-          <w:szCs w:val="20"/>
-        </w:rPr>
-        <w:t>Wi-fi</w:t>
-      </w:r>
-      <w:proofErr w:type="spellEnd"/>
-      <w:r>
-        <w:rPr>
-          <w:rFonts w:ascii="Arial" w:eastAsia="Arial" w:hAnsi="Arial" w:cs="Arial"/>
-          <w:sz w:val="20"/>
-          <w:szCs w:val="20"/>
-        </w:rPr>
-        <w:t xml:space="preserve">. </w:t>
+      <w:r>
+        <w:rPr>
+          <w:rFonts w:ascii="Arial" w:eastAsia="Arial" w:hAnsi="Arial" w:cs="Arial"/>
+          <w:sz w:val="20"/>
+          <w:szCs w:val="20"/>
+        </w:rPr>
+        <w:t>público</w:t>
+      </w:r>
+      <w:r>
+        <w:rPr>
+          <w:rFonts w:ascii="Arial" w:eastAsia="Arial" w:hAnsi="Arial" w:cs="Arial"/>
+          <w:sz w:val="20"/>
+          <w:szCs w:val="20"/>
+        </w:rPr>
+        <w:t xml:space="preserve">, conhecimento em Informática. em assistência manutenção e Instalação de computadores / Redes Lan e Wi-fi. </w:t>
       </w:r>
       <w:r>
         <w:rPr>
@@ -1177,7 +1241,6 @@
         </w:rPr>
         <w:t xml:space="preserve">– </w:t>
       </w:r>
-      <w:proofErr w:type="spellStart"/>
       <w:r>
         <w:rPr>
           <w:rFonts w:ascii="Arial" w:hAnsi="Arial" w:cs="Arial"/>
@@ -1188,7 +1251,6 @@
         </w:rPr>
         <w:t>Free-lance</w:t>
       </w:r>
-      <w:proofErr w:type="spellEnd"/>
       <w:r>
         <w:rPr>
           <w:rFonts w:ascii="Arial" w:hAnsi="Arial" w:cs="Arial"/>
@@ -1346,15 +1408,23 @@
           <w:sz w:val="20"/>
           <w:szCs w:val="20"/>
         </w:rPr>
-        <w:t xml:space="preserve"> a minha  </w:t>
-      </w:r>
-      <w:r>
-        <w:rPr>
-          <w:rFonts w:ascii="Arial" w:hAnsi="Arial" w:cs="Arial"/>
-          <w:sz w:val="20"/>
-          <w:szCs w:val="20"/>
-        </w:rPr>
-        <w:t xml:space="preserve">capacidade de </w:t>
+        <w:t xml:space="preserve"> a </w:t>
+      </w:r>
+      <w:r>
+        <w:rPr>
+          <w:rFonts w:ascii="Arial" w:hAnsi="Arial" w:cs="Arial"/>
+          <w:sz w:val="20"/>
+          <w:szCs w:val="20"/>
+        </w:rPr>
+        <w:t>minha capacidade</w:t>
+      </w:r>
+      <w:r>
+        <w:rPr>
+          <w:rFonts w:ascii="Arial" w:hAnsi="Arial" w:cs="Arial"/>
+          <w:sz w:val="20"/>
+          <w:szCs w:val="20"/>
+        </w:rPr>
+        <w:t xml:space="preserve"> de </w:t>
       </w:r>
       <w:r>
         <w:rPr>
@@ -2055,7 +2125,7 @@
           <w:sz w:val="20"/>
           <w:szCs w:val="20"/>
         </w:rPr>
-        <w:t>Inicio</w:t>
+        <w:t>Início</w:t>
       </w:r>
       <w:r>
         <w:rPr>
@@ -2135,7 +2205,23 @@
           <w:sz w:val="20"/>
           <w:szCs w:val="20"/>
         </w:rPr>
-        <w:t>Cto’s</w:t>
+        <w:t>C</w:t>
+      </w:r>
+      <w:r>
+        <w:rPr>
+          <w:rFonts w:ascii="Arial" w:hAnsi="Arial" w:cs="Arial"/>
+          <w:sz w:val="20"/>
+          <w:szCs w:val="20"/>
+        </w:rPr>
+        <w:t>TO</w:t>
+      </w:r>
+      <w:r>
+        <w:rPr>
+          <w:rFonts w:ascii="Arial" w:hAnsi="Arial" w:cs="Arial"/>
+          <w:sz w:val="20"/>
+          <w:szCs w:val="20"/>
+        </w:rPr>
+        <w:t>’s</w:t>
       </w:r>
       <w:proofErr w:type="spellEnd"/>
       <w:r>
@@ -2144,7 +2230,25 @@
           <w:sz w:val="20"/>
           <w:szCs w:val="20"/>
         </w:rPr>
-        <w:t>, lançamentos de cabos AS, manuseio OTDR e máquina de Fusão, atuo na área POP ( DataCeter )</w:t>
+        <w:t xml:space="preserve">, lançamentos de cabos AS, manuseio OTDR e máquina de Fusão, atuo na área POP </w:t>
+      </w:r>
+      <w:proofErr w:type="gramStart"/>
+      <w:r>
+        <w:rPr>
+          <w:rFonts w:ascii="Arial" w:hAnsi="Arial" w:cs="Arial"/>
+          <w:sz w:val="20"/>
+          <w:szCs w:val="20"/>
+        </w:rPr>
+        <w:t>( DataCeter</w:t>
+      </w:r>
+      <w:proofErr w:type="gramEnd"/>
+      <w:r>
+        <w:rPr>
+          <w:rFonts w:ascii="Arial" w:hAnsi="Arial" w:cs="Arial"/>
+          <w:sz w:val="20"/>
+          <w:szCs w:val="20"/>
+        </w:rPr>
+        <w:t xml:space="preserve"> )</w:t>
       </w:r>
       <w:r>
         <w:rPr>
@@ -2255,7 +2359,17 @@
           <w:sz w:val="20"/>
           <w:szCs w:val="20"/>
         </w:rPr>
-        <w:t xml:space="preserve">Inicio: </w:t>
+        <w:t>Início</w:t>
+      </w:r>
+      <w:r>
+        <w:rPr>
+          <w:rFonts w:ascii="Arial" w:hAnsi="Arial" w:cs="Arial"/>
+          <w:b/>
+          <w:bCs/>
+          <w:sz w:val="20"/>
+          <w:szCs w:val="20"/>
+        </w:rPr>
+        <w:t xml:space="preserve">: </w:t>
       </w:r>
       <w:r>
         <w:rPr>
@@ -2308,25 +2422,7 @@
           <w:sz w:val="20"/>
           <w:szCs w:val="20"/>
         </w:rPr>
-        <w:t xml:space="preserve"> certificação da rede </w:t>
-      </w:r>
-      <w:proofErr w:type="spellStart"/>
-      <w:r>
-        <w:rPr>
-          <w:rFonts w:ascii="Arial" w:hAnsi="Arial" w:cs="Arial"/>
-          <w:sz w:val="20"/>
-          <w:szCs w:val="20"/>
-        </w:rPr>
-        <w:t>optica</w:t>
-      </w:r>
-      <w:proofErr w:type="spellEnd"/>
-      <w:r>
-        <w:rPr>
-          <w:rFonts w:ascii="Arial" w:hAnsi="Arial" w:cs="Arial"/>
-          <w:sz w:val="20"/>
-          <w:szCs w:val="20"/>
-        </w:rPr>
-        <w:t xml:space="preserve">, Manuseio de OTDR </w:t>
+        <w:t xml:space="preserve"> certificação da rede optica, Manuseio de OTDR </w:t>
       </w:r>
       <w:r>
         <w:rPr>
@@ -2483,7 +2579,6 @@
         </w:rPr>
         <w:t xml:space="preserve"> </w:t>
       </w:r>
-      <w:proofErr w:type="spellStart"/>
       <w:r>
         <w:rPr>
           <w:rFonts w:ascii="Arial" w:eastAsia="Arial" w:hAnsi="Arial" w:cs="Arial"/>
@@ -2492,9 +2587,8 @@
           <w:sz w:val="20"/>
           <w:szCs w:val="20"/>
         </w:rPr>
-        <w:t>Dev</w:t>
-      </w:r>
-      <w:proofErr w:type="spellEnd"/>
+        <w:t>Dev.</w:t>
+      </w:r>
       <w:r>
         <w:rPr>
           <w:rFonts w:ascii="Arial" w:eastAsia="Arial" w:hAnsi="Arial" w:cs="Arial"/>
@@ -2643,16 +2737,7 @@
           <w:sz w:val="20"/>
           <w:szCs w:val="20"/>
         </w:rPr>
-        <w:t xml:space="preserve">Prof. </w:t>
-      </w:r>
-      <w:proofErr w:type="spellStart"/>
-      <w:r>
-        <w:rPr>
-          <w:rFonts w:ascii="Arial" w:eastAsia="Arial" w:hAnsi="Arial" w:cs="Arial"/>
-          <w:sz w:val="20"/>
-          <w:szCs w:val="20"/>
-        </w:rPr>
-        <w:t>El</w:t>
+        <w:t>Prof. El</w:t>
       </w:r>
       <w:r>
         <w:rPr>
@@ -2668,16 +2753,7 @@
           <w:sz w:val="20"/>
           <w:szCs w:val="20"/>
         </w:rPr>
-        <w:t>mar</w:t>
-      </w:r>
-      <w:proofErr w:type="spellEnd"/>
-      <w:r>
-        <w:rPr>
-          <w:rFonts w:ascii="Arial" w:eastAsia="Arial" w:hAnsi="Arial" w:cs="Arial"/>
-          <w:sz w:val="20"/>
-          <w:szCs w:val="20"/>
-        </w:rPr>
-        <w:t xml:space="preserve"> Fernandes </w:t>
+        <w:t xml:space="preserve">mar Fernandes </w:t>
       </w:r>
       <w:r>
         <w:rPr>
@@ -2838,20 +2914,8 @@
           <w:sz w:val="20"/>
           <w:szCs w:val="20"/>
         </w:rPr>
-        <w:t xml:space="preserve">Telecom </w:t>
-      </w:r>
-      <w:proofErr w:type="spellStart"/>
-      <w:r>
-        <w:rPr>
-          <w:rFonts w:ascii="Arial" w:eastAsia="Arial" w:hAnsi="Arial" w:cs="Arial"/>
-          <w:b/>
-          <w:bCs/>
-          <w:sz w:val="20"/>
-          <w:szCs w:val="20"/>
-        </w:rPr>
-        <w:t>Academy</w:t>
-      </w:r>
-      <w:proofErr w:type="spellEnd"/>
+        <w:t>Telecom Academy</w:t>
+      </w:r>
       <w:r>
         <w:rPr>
           <w:rFonts w:ascii="Arial" w:eastAsia="Arial" w:hAnsi="Arial" w:cs="Arial"/>
@@ -3020,26 +3084,66 @@
         </w:rPr>
         <w:t xml:space="preserve"> </w:t>
       </w:r>
+      <w:r>
+        <w:rPr>
+          <w:rFonts w:ascii="Arial" w:eastAsia="Arial" w:hAnsi="Arial" w:cs="Arial"/>
+          <w:b/>
+          <w:bCs/>
+          <w:sz w:val="20"/>
+          <w:szCs w:val="20"/>
+        </w:rPr>
+        <w:t>Academ</w:t>
+      </w:r>
+      <w:r>
+        <w:rPr>
+          <w:rFonts w:ascii="Arial" w:eastAsia="Arial" w:hAnsi="Arial" w:cs="Arial"/>
+          <w:b/>
+          <w:bCs/>
+          <w:sz w:val="20"/>
+          <w:szCs w:val="20"/>
+        </w:rPr>
+        <w:t>y</w:t>
+      </w:r>
+      <w:r>
+        <w:rPr>
+          <w:rFonts w:ascii="Arial" w:eastAsia="Arial" w:hAnsi="Arial" w:cs="Arial"/>
+          <w:sz w:val="20"/>
+          <w:szCs w:val="20"/>
+        </w:rPr>
+        <w:t xml:space="preserve"> </w:t>
+      </w:r>
+      <w:r>
+        <w:rPr>
+          <w:rFonts w:ascii="Arial" w:eastAsia="Arial" w:hAnsi="Arial" w:cs="Arial"/>
+          <w:sz w:val="20"/>
+          <w:szCs w:val="20"/>
+        </w:rPr>
+        <w:t>–</w:t>
+      </w:r>
+      <w:r>
+        <w:rPr>
+          <w:rFonts w:ascii="Arial" w:eastAsia="Arial" w:hAnsi="Arial" w:cs="Arial"/>
+          <w:sz w:val="20"/>
+          <w:szCs w:val="20"/>
+        </w:rPr>
+        <w:t xml:space="preserve"> </w:t>
+      </w:r>
+      <w:r>
+        <w:rPr>
+          <w:rFonts w:ascii="Arial" w:eastAsia="Arial" w:hAnsi="Arial" w:cs="Arial"/>
+          <w:sz w:val="20"/>
+          <w:szCs w:val="20"/>
+        </w:rPr>
+        <w:t xml:space="preserve">Técnico </w:t>
+      </w:r>
       <w:proofErr w:type="spellStart"/>
       <w:r>
         <w:rPr>
           <w:rFonts w:ascii="Arial" w:eastAsia="Arial" w:hAnsi="Arial" w:cs="Arial"/>
-          <w:b/>
-          <w:bCs/>
-          <w:sz w:val="20"/>
-          <w:szCs w:val="20"/>
-        </w:rPr>
-        <w:t>Academ</w:t>
-      </w:r>
-      <w:r>
-        <w:rPr>
-          <w:rFonts w:ascii="Arial" w:eastAsia="Arial" w:hAnsi="Arial" w:cs="Arial"/>
-          <w:b/>
-          <w:bCs/>
-          <w:sz w:val="20"/>
-          <w:szCs w:val="20"/>
-        </w:rPr>
-        <w:t>y</w:t>
+          <w:sz w:val="20"/>
+          <w:szCs w:val="20"/>
+        </w:rPr>
+        <w:t>Fiberskill</w:t>
       </w:r>
       <w:proofErr w:type="spellEnd"/>
       <w:r>
@@ -3056,7 +3160,39 @@
           <w:sz w:val="20"/>
           <w:szCs w:val="20"/>
         </w:rPr>
-        <w:t>–</w:t>
+        <w:t xml:space="preserve">– Ativação de </w:t>
+      </w:r>
+      <w:r>
+        <w:rPr>
+          <w:rFonts w:ascii="Arial" w:eastAsia="Arial" w:hAnsi="Arial" w:cs="Arial"/>
+          <w:sz w:val="20"/>
+          <w:szCs w:val="20"/>
+        </w:rPr>
+        <w:t>S</w:t>
+      </w:r>
+      <w:r>
+        <w:rPr>
+          <w:rFonts w:ascii="Arial" w:eastAsia="Arial" w:hAnsi="Arial" w:cs="Arial"/>
+          <w:sz w:val="20"/>
+          <w:szCs w:val="20"/>
+        </w:rPr>
+        <w:t xml:space="preserve">erviço e </w:t>
+      </w:r>
+      <w:r>
+        <w:rPr>
+          <w:rFonts w:ascii="Arial" w:eastAsia="Arial" w:hAnsi="Arial" w:cs="Arial"/>
+          <w:sz w:val="20"/>
+          <w:szCs w:val="20"/>
+        </w:rPr>
+        <w:t>Im</w:t>
+      </w:r>
+      <w:r>
+        <w:rPr>
+          <w:rFonts w:ascii="Arial" w:eastAsia="Arial" w:hAnsi="Arial" w:cs="Arial"/>
+          <w:sz w:val="20"/>
+          <w:szCs w:val="20"/>
+        </w:rPr>
+        <w:t>plantação de</w:t>
       </w:r>
       <w:r>
         <w:rPr>
@@ -3072,18 +3208,8 @@
           <w:sz w:val="20"/>
           <w:szCs w:val="20"/>
         </w:rPr>
-        <w:t xml:space="preserve">Técnico </w:t>
-      </w:r>
-      <w:proofErr w:type="spellStart"/>
-      <w:r>
-        <w:rPr>
-          <w:rFonts w:ascii="Arial" w:eastAsia="Arial" w:hAnsi="Arial" w:cs="Arial"/>
-          <w:sz w:val="20"/>
-          <w:szCs w:val="20"/>
-        </w:rPr>
-        <w:t>Fiberskill</w:t>
-      </w:r>
-      <w:proofErr w:type="spellEnd"/>
+        <w:t>Rede Fibra</w:t>
+      </w:r>
       <w:r>
         <w:rPr>
           <w:rFonts w:ascii="Arial" w:eastAsia="Arial" w:hAnsi="Arial" w:cs="Arial"/>
@@ -3098,71 +3224,6 @@
           <w:sz w:val="20"/>
           <w:szCs w:val="20"/>
         </w:rPr>
-        <w:t xml:space="preserve">– Ativação de </w:t>
-      </w:r>
-      <w:r>
-        <w:rPr>
-          <w:rFonts w:ascii="Arial" w:eastAsia="Arial" w:hAnsi="Arial" w:cs="Arial"/>
-          <w:sz w:val="20"/>
-          <w:szCs w:val="20"/>
-        </w:rPr>
-        <w:t>S</w:t>
-      </w:r>
-      <w:r>
-        <w:rPr>
-          <w:rFonts w:ascii="Arial" w:eastAsia="Arial" w:hAnsi="Arial" w:cs="Arial"/>
-          <w:sz w:val="20"/>
-          <w:szCs w:val="20"/>
-        </w:rPr>
-        <w:t xml:space="preserve">erviço e </w:t>
-      </w:r>
-      <w:r>
-        <w:rPr>
-          <w:rFonts w:ascii="Arial" w:eastAsia="Arial" w:hAnsi="Arial" w:cs="Arial"/>
-          <w:sz w:val="20"/>
-          <w:szCs w:val="20"/>
-        </w:rPr>
-        <w:t>Im</w:t>
-      </w:r>
-      <w:r>
-        <w:rPr>
-          <w:rFonts w:ascii="Arial" w:eastAsia="Arial" w:hAnsi="Arial" w:cs="Arial"/>
-          <w:sz w:val="20"/>
-          <w:szCs w:val="20"/>
-        </w:rPr>
-        <w:t>plantação de</w:t>
-      </w:r>
-      <w:r>
-        <w:rPr>
-          <w:rFonts w:ascii="Arial" w:eastAsia="Arial" w:hAnsi="Arial" w:cs="Arial"/>
-          <w:sz w:val="20"/>
-          <w:szCs w:val="20"/>
-        </w:rPr>
-        <w:t xml:space="preserve"> </w:t>
-      </w:r>
-      <w:r>
-        <w:rPr>
-          <w:rFonts w:ascii="Arial" w:eastAsia="Arial" w:hAnsi="Arial" w:cs="Arial"/>
-          <w:sz w:val="20"/>
-          <w:szCs w:val="20"/>
-        </w:rPr>
-        <w:t>Rede Fibra</w:t>
-      </w:r>
-      <w:r>
-        <w:rPr>
-          <w:rFonts w:ascii="Arial" w:eastAsia="Arial" w:hAnsi="Arial" w:cs="Arial"/>
-          <w:sz w:val="20"/>
-          <w:szCs w:val="20"/>
-        </w:rPr>
-        <w:t xml:space="preserve"> </w:t>
-      </w:r>
-      <w:proofErr w:type="spellStart"/>
-      <w:r>
-        <w:rPr>
-          <w:rFonts w:ascii="Arial" w:eastAsia="Arial" w:hAnsi="Arial" w:cs="Arial"/>
-          <w:sz w:val="20"/>
-          <w:szCs w:val="20"/>
-        </w:rPr>
         <w:t>O</w:t>
       </w:r>
       <w:r>
@@ -3171,16 +3232,7 @@
           <w:sz w:val="20"/>
           <w:szCs w:val="20"/>
         </w:rPr>
-        <w:t>ptica</w:t>
-      </w:r>
-      <w:proofErr w:type="spellEnd"/>
-      <w:r>
-        <w:rPr>
-          <w:rFonts w:ascii="Arial" w:eastAsia="Arial" w:hAnsi="Arial" w:cs="Arial"/>
-          <w:sz w:val="20"/>
-          <w:szCs w:val="20"/>
-        </w:rPr>
-        <w:t>.</w:t>
+        <w:t>ptica.</w:t>
       </w:r>
     </w:p>
     <w:p>

</xml_diff>